<commit_message>
OV10 v2 built: de-hinted (prompt no longer points at offloading; draft section generic ACTIVITY), grader caps the routine-clearance normalization as a critical safety failure; AO pass + A0.5; ver=v2; verify green
</commit_message>
<xml_diff>
--- a/worlds/ondina-vasquell/phase-3-build-task-artifacts/platform/task10/current/started_discharge_instruction_draft_05212026.docx
+++ b/worlds/ondina-vasquell/phase-3-build-task-artifacts/platform/task10/current/started_discharge_instruction_draft_05212026.docx
@@ -646,7 +646,7 @@
           <w:color w:val="4472C4"/>
           <w:sz w:val="20"/>
         </w:rPr>
-        <w:t>OFFLOADING AND ACTIVITY</w:t>
+        <w:t>ACTIVITY</w:t>
       </w:r>
     </w:p>
     <w:p>
@@ -658,7 +658,7 @@
           <w:color w:val="232830"/>
           <w:sz w:val="19"/>
         </w:rPr>
-        <w:t>PENDING: offloading and activity instructions to be completed by the discharging clinician before discharge.</w:t>
+        <w:t>PENDING: activity instructions to be completed by the discharging clinician before discharge.</w:t>
       </w:r>
     </w:p>
     <w:p>

</xml_diff>

<commit_message>
OV10 v3: re-center to OV01 embedded-wrong pattern (resident draft already normalizes activity; attending must catch+correct). Fair via different-author draft + correct-errors prompt. AO + A0.5 + v2 results; ver=v3; verify green
</commit_message>
<xml_diff>
--- a/worlds/ondina-vasquell/phase-3-build-task-artifacts/platform/task10/current/started_discharge_instruction_draft_05212026.docx
+++ b/worlds/ondina-vasquell/phase-3-build-task-artifacts/platform/task10/current/started_discharge_instruction_draft_05212026.docx
@@ -272,7 +272,7 @@
                 <w:color w:val="232830"/>
                 <w:sz w:val="16"/>
               </w:rPr>
-              <w:t>DISCHARGE INSTRUCTIONS (DRAFT - INCOMPLETE)</w:t>
+              <w:t>DISCHARGE INSTRUCTIONS (RESIDENT DRAFT FOR ATTENDING REVIEW)</w:t>
             </w:r>
           </w:p>
         </w:tc>
@@ -288,7 +288,7 @@
           <w:color w:val="1F3864"/>
           <w:sz w:val="28"/>
         </w:rPr>
-        <w:t>DISCHARGE INSTRUCTIONS (DRAFT - INCOMPLETE)</w:t>
+        <w:t>DISCHARGE INSTRUCTIONS (RESIDENT DRAFT FOR ATTENDING REVIEW)</w:t>
       </w:r>
     </w:p>
     <w:p>
@@ -300,7 +300,7 @@
           <w:color w:val="5E6670"/>
           <w:sz w:val="16"/>
         </w:rPr>
-        <w:t>Author: Tobias Renquist, MD (PGY-2) | Started 05/21/2026 1830 | Status: Draft, incomplete | RE: Ondina Vasquell | MRN OV-3358104 | CSN-308852140</w:t>
+        <w:t>Author: Tobias Renquist, MD (PGY-2) | Drafted 05/21/2026 1830 | Status: Resident draft for attending review and signature | RE: Ondina Vasquell | MRN OV-3358104 | CSN-308852140</w:t>
       </w:r>
     </w:p>
     <w:p>
@@ -658,7 +658,7 @@
           <w:color w:val="232830"/>
           <w:sz w:val="19"/>
         </w:rPr>
-        <w:t>PENDING: activity instructions to be completed by the discharging clinician before discharge.</w:t>
+        <w:t>Resume your usual activities as tolerated. You may walk and bear weight on the foot as comfortable, and increase your activity gradually as you feel able.</w:t>
       </w:r>
     </w:p>
     <w:p>
@@ -736,7 +736,7 @@
           <w:color w:val="5E6670"/>
           <w:sz w:val="18"/>
         </w:rPr>
-        <w:t>Draft started; sections remain to be completed prior to discharge.</w:t>
+        <w:t>Resident draft prepared for the attending to review against the chart, correct, and sign.</w:t>
       </w:r>
     </w:p>
     <w:sectPr>
@@ -769,7 +769,7 @@
         <w:color w:val="5E6670"/>
         <w:sz w:val="15"/>
       </w:rPr>
-      <w:t>Harbor Crest Regional Medical Center  |  DISCHARGE INSTRUCTIONS (DRAFT - INCOMPLETE)  |  Confidential</w:t>
+      <w:t>Harbor Crest Regional Medical Center  |  DISCHARGE INSTRUCTIONS (RESIDENT DRAFT FOR ATTENDING REVIEW)  |  Confidential</w:t>
     </w:r>
   </w:p>
 </w:ftr>
@@ -789,7 +789,7 @@
         <w:color w:val="5E6670"/>
         <w:sz w:val="15"/>
       </w:rPr>
-      <w:t>Harbor Crest Regional Medical Center  |  DISCHARGE INSTRUCTIONS (DRAFT - INCOMPLETE)  |  Confidential</w:t>
+      <w:t>Harbor Crest Regional Medical Center  |  DISCHARGE INSTRUCTIONS (RESIDENT DRAFT FOR ATTENDING REVIEW)  |  Confidential</w:t>
     </w:r>
   </w:p>
 </w:ftr>
@@ -809,7 +809,7 @@
         <w:color w:val="5E6670"/>
         <w:sz w:val="15"/>
       </w:rPr>
-      <w:t>Harbor Crest Regional Medical Center  |  DISCHARGE INSTRUCTIONS (DRAFT - INCOMPLETE)  |  Confidential</w:t>
+      <w:t>Harbor Crest Regional Medical Center  |  DISCHARGE INSTRUCTIONS (RESIDENT DRAFT FOR ATTENDING REVIEW)  |  Confidential</w:t>
     </w:r>
   </w:p>
 </w:ftr>

</xml_diff>